<commit_message>
Update insandare.html with updated and new articles up to week 34
</commit_message>
<xml_diff>
--- a/material/insandare/v21 Ett föreningsliv i toppklass.docx
+++ b/material/insandare/v21 Ett föreningsliv i toppklass.docx
@@ -132,10 +132,7 @@
         <w:t xml:space="preserve"> Vi behöver förstå</w:t>
       </w:r>
       <w:r>
-        <w:t xml:space="preserve"> </w:t>
-      </w:r>
-      <w:r>
-        <w:t xml:space="preserve">utmaningar och möjligheter </w:t>
+        <w:t xml:space="preserve"> utmaningar och möjligheter </w:t>
       </w:r>
       <w:r>
         <w:t>för att tillsammans hitta långsiktiga och bra lösningar</w:t>
@@ -203,10 +200,7 @@
         <w:t xml:space="preserve"> och tävlingar</w:t>
       </w:r>
       <w:r>
-        <w:t xml:space="preserve">. </w:t>
-      </w:r>
-      <w:r>
-        <w:t>Framgång föder framgång</w:t>
+        <w:t>. Framgång föder framgång</w:t>
       </w:r>
       <w:r>
         <w:t xml:space="preserve"> och bidrar till</w:t>
@@ -356,74 +350,6 @@
       </w:r>
     </w:p>
     <w:p/>
-    <w:p/>
-    <w:p>
-      <w:r>
-        <w:br w:type="page"/>
-      </w:r>
-    </w:p>
-    <w:p>
-      <w:r>
-        <w:lastRenderedPageBreak/>
-        <w:t xml:space="preserve">Ett av Ales stora kännetecken är det starka föreningslivet. Varje dag, året runt, tvättas västar, koner ställs ut, övningar planeras och matcher arrangeras. På helgerna står föräldrar i kiosker och säljer chokladbollar, kaffe och bullar. Tränare inom allt från taekwondo till brottning lägger otaliga timmar på att hjälpa barn och unga att växa och hitta sin plats. Det är oglamouröst, men just därför så värdefullt. Här, i vardagens små insatser, byggs gemenskap och trygghet. </w:t>
-      </w:r>
-      <w:r>
-        <w:rPr>
-          <w:b/>
-          <w:bCs/>
-        </w:rPr>
-        <w:t>Eldsjälarna är vår tids superhjältar.</w:t>
-      </w:r>
-    </w:p>
-    <w:p>
-      <w:r>
-        <w:t>I kommuner som fungerar riktigt bra är föreningslivet en självklar hörnsten. Det skapar sammanhang, mening och en trygghet som växer ur möten mellan människor. För politiken finns alltid en risk att vilja styra för mycket och därmed kväva engagemanget. Moderaterna ser politiken som en partner snarare än en huvudman. Det som ska skötas gemensamt sköter vi ordentligt, så att vi kan fortsätta njuta av kulturskolans fantastiska föreställningar. Det som föreningslivet gör bäst ska föreningslivet fortsätta göra, medan politiken stöttar och möjliggör.</w:t>
-      </w:r>
-    </w:p>
-    <w:p>
-      <w:r>
-        <w:t xml:space="preserve">En tidig reform under mandatperioden var att avveckla kultur- och fritidsnämnden. Kritiker målade upp bilden av att den sista fotbollen var sparkad och att himlen skulle falla ner över </w:t>
-      </w:r>
-      <w:proofErr w:type="spellStart"/>
-      <w:r>
-        <w:t>Vimmervi</w:t>
-      </w:r>
-      <w:proofErr w:type="spellEnd"/>
-      <w:r>
-        <w:t>. I verkligheten innebar förändringen att resurser som tidigare gått till politikerarvoden istället kunde gå direkt till föreningarna. Politiken tog ett steg tillbaka, samtidigt som förutsättningarna för föreningslivet stärktes.</w:t>
-      </w:r>
-    </w:p>
-    <w:p>
-      <w:r>
-        <w:t>Det är den vägen vi vill fortsätta på. Politiken som partner och möjliggörare. Att stötta ekonomiskt, men också underlätta genom att bygga ut infrastrukturen runt våra idrottsanläggningar och friluftsområden. Små förbättringar som tillsammans gör stor skillnad i människors vardag och stärker den lokala gemenskapen.</w:t>
-      </w:r>
-    </w:p>
-    <w:p>
-      <w:r>
-        <w:t>För i grunden handlar ett starkt föreningsliv om mer än aktiviteter och träningar. Det handlar om att människor möts, lär känna varandra och känner sig hemma. Det är så trygghet växer – genom tusentals små möten som tillsammans formar ett samhälle där man vill leva och låta sina barn växa upp.</w:t>
-      </w:r>
-    </w:p>
-    <w:p>
-      <w:pPr>
-        <w:rPr>
-          <w:b/>
-          <w:bCs/>
-        </w:rPr>
-      </w:pPr>
-      <w:r>
-        <w:rPr>
-          <w:b/>
-          <w:bCs/>
-        </w:rPr>
-        <w:t>Ale är på rätt väg.</w:t>
-      </w:r>
-    </w:p>
-    <w:p/>
-    <w:p>
-      <w:r>
-        <w:t>Henrik Fogelklou (M), kommunstyrelsens ordförande</w:t>
-      </w:r>
-    </w:p>
     <w:sectPr>
       <w:pgSz w:w="11906" w:h="16838"/>
       <w:pgMar w:top="1417" w:right="1417" w:bottom="1417" w:left="1417" w:header="708" w:footer="708" w:gutter="0"/>
@@ -1037,6 +963,7 @@
   <w:style w:type="character" w:default="1" w:styleId="Standardstycketeckensnitt">
     <w:name w:val="Default Paragraph Font"/>
     <w:uiPriority w:val="1"/>
+    <w:semiHidden/>
     <w:unhideWhenUsed/>
   </w:style>
   <w:style w:type="table" w:default="1" w:styleId="Normaltabell">

</xml_diff>